<commit_message>
Now Full Introduction Reviewed
</commit_message>
<xml_diff>
--- a/ShebaHub_ A Multi-Role Digital Job and Service Marketplace.docx
+++ b/ShebaHub_ A Multi-Role Digital Job and Service Marketplace.docx
@@ -1485,17 +1485,7 @@
           <w:sz w:val="24"/>
           <w:szCs w:val="24"/>
         </w:rPr>
-        <w:t>The project is also encouraged by the opportunity of implementing the concepts of software engineering in a practical application. This involves the requirement analysis, designing the database, building a RESTful API, implementing layered architecture, role-based auth</w:t>
-      </w:r>
-      <w:bookmarkStart w:id="8" w:name="_GoBack"/>
-      <w:bookmarkEnd w:id="8"/>
-      <w:r>
-        <w:rPr>
-          <w:rFonts w:ascii="Times New Roman" w:eastAsia="Times New Roman" w:hAnsi="Times New Roman" w:cs="Times New Roman"/>
-          <w:sz w:val="24"/>
-          <w:szCs w:val="24"/>
-        </w:rPr>
-        <w:t xml:space="preserve">orization, </w:t>
+        <w:t xml:space="preserve">The project is also encouraged by the opportunity of implementing the concepts of software engineering in a practical application. This involves the requirement analysis, designing the database, building a RESTful API, implementing layered architecture, role-based authorization, </w:t>
       </w:r>
       <w:r>
         <w:rPr>
@@ -1511,8 +1501,8 @@
       <w:pPr>
         <w:pStyle w:val="Heading2"/>
       </w:pPr>
-      <w:bookmarkStart w:id="9" w:name="_toif0xh2herz" w:colFirst="0" w:colLast="0"/>
-      <w:bookmarkEnd w:id="9"/>
+      <w:bookmarkStart w:id="8" w:name="_toif0xh2herz" w:colFirst="0" w:colLast="0"/>
+      <w:bookmarkEnd w:id="8"/>
       <w:r>
         <w:rPr>
           <w:b/>
@@ -1527,8 +1517,8 @@
       <w:pPr>
         <w:pStyle w:val="Heading3"/>
       </w:pPr>
-      <w:bookmarkStart w:id="10" w:name="_yxmnwrt60la3" w:colFirst="0" w:colLast="0"/>
-      <w:bookmarkEnd w:id="10"/>
+      <w:bookmarkStart w:id="9" w:name="_yxmnwrt60la3" w:colFirst="0" w:colLast="0"/>
+      <w:bookmarkEnd w:id="9"/>
       <w:r>
         <w:rPr>
           <w:b/>
@@ -1591,8 +1581,8 @@
       <w:pPr>
         <w:pStyle w:val="Heading3"/>
       </w:pPr>
-      <w:bookmarkStart w:id="11" w:name="_l9niaxv8boc1" w:colFirst="0" w:colLast="0"/>
-      <w:bookmarkEnd w:id="11"/>
+      <w:bookmarkStart w:id="10" w:name="_l9niaxv8boc1" w:colFirst="0" w:colLast="0"/>
+      <w:bookmarkEnd w:id="10"/>
       <w:r>
         <w:rPr>
           <w:b/>
@@ -1829,8 +1819,8 @@
       <w:pPr>
         <w:pStyle w:val="Heading2"/>
       </w:pPr>
-      <w:bookmarkStart w:id="12" w:name="_droh5qm4m6uk" w:colFirst="0" w:colLast="0"/>
-      <w:bookmarkEnd w:id="12"/>
+      <w:bookmarkStart w:id="11" w:name="_droh5qm4m6uk" w:colFirst="0" w:colLast="0"/>
+      <w:bookmarkEnd w:id="11"/>
       <w:r>
         <w:rPr>
           <w:b/>
@@ -1876,8 +1866,8 @@
       <w:pPr>
         <w:pStyle w:val="Heading3"/>
       </w:pPr>
-      <w:bookmarkStart w:id="13" w:name="_r1ypjgwiyox1" w:colFirst="0" w:colLast="0"/>
-      <w:bookmarkEnd w:id="13"/>
+      <w:bookmarkStart w:id="12" w:name="_r1ypjgwiyox1" w:colFirst="0" w:colLast="0"/>
+      <w:bookmarkEnd w:id="12"/>
       <w:r>
         <w:rPr>
           <w:b/>
@@ -2233,8 +2223,8 @@
       <w:pPr>
         <w:pStyle w:val="Heading3"/>
       </w:pPr>
-      <w:bookmarkStart w:id="14" w:name="_i36ttx4m9uhj" w:colFirst="0" w:colLast="0"/>
-      <w:bookmarkEnd w:id="14"/>
+      <w:bookmarkStart w:id="13" w:name="_i36ttx4m9uhj" w:colFirst="0" w:colLast="0"/>
+      <w:bookmarkEnd w:id="13"/>
       <w:r>
         <w:rPr>
           <w:b/>
@@ -2499,8 +2489,8 @@
       <w:pPr>
         <w:pStyle w:val="Heading3"/>
       </w:pPr>
-      <w:bookmarkStart w:id="15" w:name="_hzl482qtbek4" w:colFirst="0" w:colLast="0"/>
-      <w:bookmarkEnd w:id="15"/>
+      <w:bookmarkStart w:id="14" w:name="_hzl482qtbek4" w:colFirst="0" w:colLast="0"/>
+      <w:bookmarkEnd w:id="14"/>
       <w:r>
         <w:rPr>
           <w:b/>
@@ -2695,8 +2685,8 @@
       <w:pPr>
         <w:pStyle w:val="Heading3"/>
       </w:pPr>
-      <w:bookmarkStart w:id="16" w:name="_o38583dz87su" w:colFirst="0" w:colLast="0"/>
-      <w:bookmarkEnd w:id="16"/>
+      <w:bookmarkStart w:id="15" w:name="_o38583dz87su" w:colFirst="0" w:colLast="0"/>
+      <w:bookmarkEnd w:id="15"/>
       <w:r>
         <w:rPr>
           <w:b/>
@@ -2888,8 +2878,8 @@
       <w:pPr>
         <w:pStyle w:val="Heading3"/>
       </w:pPr>
-      <w:bookmarkStart w:id="17" w:name="_j9z6fwp0yz39" w:colFirst="0" w:colLast="0"/>
-      <w:bookmarkEnd w:id="17"/>
+      <w:bookmarkStart w:id="16" w:name="_j9z6fwp0yz39" w:colFirst="0" w:colLast="0"/>
+      <w:bookmarkEnd w:id="16"/>
       <w:r>
         <w:rPr>
           <w:b/>
@@ -3123,8 +3113,8 @@
       <w:pPr>
         <w:pStyle w:val="Heading2"/>
       </w:pPr>
-      <w:bookmarkStart w:id="18" w:name="_b2it8ydi3tqh" w:colFirst="0" w:colLast="0"/>
-      <w:bookmarkEnd w:id="18"/>
+      <w:bookmarkStart w:id="17" w:name="_b2it8ydi3tqh" w:colFirst="0" w:colLast="0"/>
+      <w:bookmarkEnd w:id="17"/>
       <w:r>
         <w:rPr>
           <w:b/>
@@ -3459,8 +3449,8 @@
       <w:pPr>
         <w:pStyle w:val="Heading2"/>
       </w:pPr>
-      <w:bookmarkStart w:id="19" w:name="_rpczgyrlz3tg" w:colFirst="0" w:colLast="0"/>
-      <w:bookmarkEnd w:id="19"/>
+      <w:bookmarkStart w:id="18" w:name="_rpczgyrlz3tg" w:colFirst="0" w:colLast="0"/>
+      <w:bookmarkEnd w:id="18"/>
       <w:r>
         <w:rPr>
           <w:b/>
@@ -3476,8 +3466,8 @@
       <w:pPr>
         <w:pStyle w:val="Heading3"/>
       </w:pPr>
-      <w:bookmarkStart w:id="20" w:name="_1vyoqmgp5wdd" w:colFirst="0" w:colLast="0"/>
-      <w:bookmarkEnd w:id="20"/>
+      <w:bookmarkStart w:id="19" w:name="_1vyoqmgp5wdd" w:colFirst="0" w:colLast="0"/>
+      <w:bookmarkEnd w:id="19"/>
       <w:r>
         <w:rPr>
           <w:b/>
@@ -3792,6 +3782,7 @@
                 <w:rFonts w:ascii="Times New Roman" w:eastAsia="Times New Roman" w:hAnsi="Times New Roman" w:cs="Times New Roman"/>
                 <w:sz w:val="24"/>
                 <w:szCs w:val="24"/>
+                <w:highlight w:val="yellow"/>
               </w:rPr>
             </w:pPr>
             <w:r>
@@ -3801,6 +3792,7 @@
                 <w:bCs/>
                 <w:sz w:val="24"/>
                 <w:szCs w:val="24"/>
+                <w:highlight w:val="yellow"/>
               </w:rPr>
               <w:t>Hosting and infrastructure</w:t>
             </w:r>
@@ -3830,6 +3822,7 @@
                 <w:rFonts w:ascii="Times New Roman" w:eastAsia="Times New Roman" w:hAnsi="Times New Roman" w:cs="Times New Roman"/>
                 <w:sz w:val="24"/>
                 <w:szCs w:val="24"/>
+                <w:highlight w:val="yellow"/>
               </w:rPr>
             </w:pPr>
             <w:r>
@@ -3837,6 +3830,7 @@
                 <w:rFonts w:ascii="Times New Roman" w:eastAsia="Times New Roman" w:hAnsi="Times New Roman" w:cs="Times New Roman"/>
                 <w:sz w:val="24"/>
                 <w:szCs w:val="24"/>
+                <w:highlight w:val="yellow"/>
               </w:rPr>
               <w:t>Database, server, deployment, domain, and related resources</w:t>
             </w:r>
@@ -3875,6 +3869,7 @@
                 <w:bCs/>
                 <w:sz w:val="24"/>
                 <w:szCs w:val="24"/>
+                <w:highlight w:val="yellow"/>
               </w:rPr>
               <w:t>10,000</w:t>
             </w:r>
@@ -4588,25 +4583,23 @@
           <w:sz w:val="24"/>
           <w:szCs w:val="24"/>
         </w:rPr>
-        <w:t xml:space="preserve">This is a fair price for an academic prototype project employing open-source technologies like Angular, ASP.NET Core, </w:t>
-      </w:r>
-      <w:proofErr w:type="spellStart"/>
-      <w:r>
-        <w:rPr>
-          <w:rFonts w:ascii="Times New Roman" w:eastAsia="Times New Roman" w:hAnsi="Times New Roman" w:cs="Times New Roman"/>
-          <w:sz w:val="24"/>
-          <w:szCs w:val="24"/>
-        </w:rPr>
-        <w:t>EntityFramework</w:t>
-      </w:r>
-      <w:proofErr w:type="spellEnd"/>
-      <w:r>
-        <w:rPr>
-          <w:rFonts w:ascii="Times New Roman" w:eastAsia="Times New Roman" w:hAnsi="Times New Roman" w:cs="Times New Roman"/>
-          <w:sz w:val="24"/>
-          <w:szCs w:val="24"/>
-        </w:rPr>
-        <w:t xml:space="preserve"> Core, </w:t>
+        <w:t>This is a fair price for an academic prototype project employing open-source technologies like Angular, ASP.NET Core, Entity</w:t>
+      </w:r>
+      <w:r>
+        <w:rPr>
+          <w:rFonts w:ascii="Times New Roman" w:eastAsia="Times New Roman" w:hAnsi="Times New Roman" w:cs="Times New Roman"/>
+          <w:sz w:val="24"/>
+          <w:szCs w:val="24"/>
+        </w:rPr>
+        <w:t xml:space="preserve"> </w:t>
+      </w:r>
+      <w:r>
+        <w:rPr>
+          <w:rFonts w:ascii="Times New Roman" w:eastAsia="Times New Roman" w:hAnsi="Times New Roman" w:cs="Times New Roman"/>
+          <w:sz w:val="24"/>
+          <w:szCs w:val="24"/>
+        </w:rPr>
+        <w:t xml:space="preserve">Framework Core, </w:t>
       </w:r>
       <w:proofErr w:type="gramStart"/>
       <w:r>
@@ -4630,15 +4623,18 @@
     <w:p>
       <w:pPr>
         <w:pStyle w:val="Heading3"/>
-      </w:pPr>
-      <w:bookmarkStart w:id="21" w:name="_mqm1fw8j1uhs" w:colFirst="0" w:colLast="0"/>
-      <w:bookmarkEnd w:id="21"/>
+        <w:rPr>
+          <w:highlight w:val="yellow"/>
+        </w:rPr>
+      </w:pPr>
+      <w:bookmarkStart w:id="20" w:name="_mqm1fw8j1uhs" w:colFirst="0" w:colLast="0"/>
+      <w:bookmarkEnd w:id="20"/>
       <w:r>
         <w:rPr>
           <w:b/>
           <w:bCs/>
           <w:color w:val="434343"/>
-          <w:highlight w:val="white"/>
+          <w:highlight w:val="yellow"/>
         </w:rPr>
         <w:lastRenderedPageBreak/>
         <w:t>1.7.2 Project Schedule</w:t>
@@ -4652,13 +4648,15 @@
           <w:rFonts w:ascii="Times New Roman" w:eastAsia="Times New Roman" w:hAnsi="Times New Roman" w:cs="Times New Roman"/>
           <w:sz w:val="24"/>
           <w:szCs w:val="24"/>
-        </w:rPr>
-      </w:pPr>
-      <w:r>
-        <w:rPr>
-          <w:rFonts w:ascii="Times New Roman" w:eastAsia="Times New Roman" w:hAnsi="Times New Roman" w:cs="Times New Roman"/>
-          <w:sz w:val="24"/>
-          <w:szCs w:val="24"/>
+          <w:highlight w:val="yellow"/>
+        </w:rPr>
+      </w:pPr>
+      <w:r>
+        <w:rPr>
+          <w:rFonts w:ascii="Times New Roman" w:eastAsia="Times New Roman" w:hAnsi="Times New Roman" w:cs="Times New Roman"/>
+          <w:sz w:val="24"/>
+          <w:szCs w:val="24"/>
+          <w:highlight w:val="yellow"/>
         </w:rPr>
         <w:t>The project can be broken down into six milestones:</w:t>
       </w:r>
@@ -4713,6 +4711,7 @@
                 <w:bCs/>
                 <w:sz w:val="24"/>
                 <w:szCs w:val="24"/>
+                <w:highlight w:val="yellow"/>
               </w:rPr>
             </w:pPr>
             <w:r>
@@ -4722,6 +4721,7 @@
                 <w:bCs/>
                 <w:sz w:val="24"/>
                 <w:szCs w:val="24"/>
+                <w:highlight w:val="yellow"/>
               </w:rPr>
               <w:t>Milestone</w:t>
             </w:r>
@@ -4753,6 +4753,7 @@
                 <w:bCs/>
                 <w:sz w:val="24"/>
                 <w:szCs w:val="24"/>
+                <w:highlight w:val="yellow"/>
               </w:rPr>
             </w:pPr>
             <w:r>
@@ -4762,6 +4763,7 @@
                 <w:bCs/>
                 <w:sz w:val="24"/>
                 <w:szCs w:val="24"/>
+                <w:highlight w:val="yellow"/>
               </w:rPr>
               <w:t>Activities</w:t>
             </w:r>
@@ -4777,6 +4779,7 @@
           <w:rFonts w:ascii="Times New Roman" w:eastAsia="Times New Roman" w:hAnsi="Times New Roman" w:cs="Times New Roman"/>
           <w:sz w:val="24"/>
           <w:szCs w:val="24"/>
+          <w:highlight w:val="yellow"/>
         </w:rPr>
       </w:pPr>
     </w:p>
@@ -4828,6 +4831,7 @@
                 <w:rFonts w:ascii="Times New Roman" w:eastAsia="Times New Roman" w:hAnsi="Times New Roman" w:cs="Times New Roman"/>
                 <w:sz w:val="24"/>
                 <w:szCs w:val="24"/>
+                <w:highlight w:val="yellow"/>
               </w:rPr>
             </w:pPr>
             <w:r>
@@ -4835,6 +4839,7 @@
                 <w:rFonts w:ascii="Times New Roman" w:eastAsia="Times New Roman" w:hAnsi="Times New Roman" w:cs="Times New Roman"/>
                 <w:sz w:val="24"/>
                 <w:szCs w:val="24"/>
+                <w:highlight w:val="yellow"/>
               </w:rPr>
               <w:t>M1</w:t>
             </w:r>
@@ -4864,6 +4869,7 @@
                 <w:rFonts w:ascii="Times New Roman" w:eastAsia="Times New Roman" w:hAnsi="Times New Roman" w:cs="Times New Roman"/>
                 <w:sz w:val="24"/>
                 <w:szCs w:val="24"/>
+                <w:highlight w:val="yellow"/>
               </w:rPr>
             </w:pPr>
             <w:r>
@@ -4871,6 +4877,7 @@
                 <w:rFonts w:ascii="Times New Roman" w:eastAsia="Times New Roman" w:hAnsi="Times New Roman" w:cs="Times New Roman"/>
                 <w:sz w:val="24"/>
                 <w:szCs w:val="24"/>
+                <w:highlight w:val="yellow"/>
               </w:rPr>
               <w:t>Requirements analysis and literature review</w:t>
             </w:r>
@@ -4886,6 +4893,7 @@
           <w:rFonts w:ascii="Times New Roman" w:eastAsia="Times New Roman" w:hAnsi="Times New Roman" w:cs="Times New Roman"/>
           <w:sz w:val="24"/>
           <w:szCs w:val="24"/>
+          <w:highlight w:val="yellow"/>
         </w:rPr>
       </w:pPr>
     </w:p>
@@ -4937,6 +4945,7 @@
                 <w:rFonts w:ascii="Times New Roman" w:eastAsia="Times New Roman" w:hAnsi="Times New Roman" w:cs="Times New Roman"/>
                 <w:sz w:val="24"/>
                 <w:szCs w:val="24"/>
+                <w:highlight w:val="yellow"/>
               </w:rPr>
             </w:pPr>
             <w:r>
@@ -4944,6 +4953,7 @@
                 <w:rFonts w:ascii="Times New Roman" w:eastAsia="Times New Roman" w:hAnsi="Times New Roman" w:cs="Times New Roman"/>
                 <w:sz w:val="24"/>
                 <w:szCs w:val="24"/>
+                <w:highlight w:val="yellow"/>
               </w:rPr>
               <w:t>M2</w:t>
             </w:r>
@@ -4973,6 +4983,7 @@
                 <w:rFonts w:ascii="Times New Roman" w:eastAsia="Times New Roman" w:hAnsi="Times New Roman" w:cs="Times New Roman"/>
                 <w:sz w:val="24"/>
                 <w:szCs w:val="24"/>
+                <w:highlight w:val="yellow"/>
               </w:rPr>
             </w:pPr>
             <w:r>
@@ -4980,6 +4991,7 @@
                 <w:rFonts w:ascii="Times New Roman" w:eastAsia="Times New Roman" w:hAnsi="Times New Roman" w:cs="Times New Roman"/>
                 <w:sz w:val="24"/>
                 <w:szCs w:val="24"/>
+                <w:highlight w:val="yellow"/>
               </w:rPr>
               <w:t>System analysis and design</w:t>
             </w:r>
@@ -4995,6 +5007,7 @@
           <w:rFonts w:ascii="Times New Roman" w:eastAsia="Times New Roman" w:hAnsi="Times New Roman" w:cs="Times New Roman"/>
           <w:sz w:val="24"/>
           <w:szCs w:val="24"/>
+          <w:highlight w:val="yellow"/>
         </w:rPr>
       </w:pPr>
     </w:p>
@@ -5046,6 +5059,7 @@
                 <w:rFonts w:ascii="Times New Roman" w:eastAsia="Times New Roman" w:hAnsi="Times New Roman" w:cs="Times New Roman"/>
                 <w:sz w:val="24"/>
                 <w:szCs w:val="24"/>
+                <w:highlight w:val="yellow"/>
               </w:rPr>
             </w:pPr>
             <w:r>
@@ -5053,6 +5067,7 @@
                 <w:rFonts w:ascii="Times New Roman" w:eastAsia="Times New Roman" w:hAnsi="Times New Roman" w:cs="Times New Roman"/>
                 <w:sz w:val="24"/>
                 <w:szCs w:val="24"/>
+                <w:highlight w:val="yellow"/>
               </w:rPr>
               <w:t>M3</w:t>
             </w:r>
@@ -5082,6 +5097,7 @@
                 <w:rFonts w:ascii="Times New Roman" w:eastAsia="Times New Roman" w:hAnsi="Times New Roman" w:cs="Times New Roman"/>
                 <w:sz w:val="24"/>
                 <w:szCs w:val="24"/>
+                <w:highlight w:val="yellow"/>
               </w:rPr>
             </w:pPr>
             <w:r>
@@ -5089,6 +5105,7 @@
                 <w:rFonts w:ascii="Times New Roman" w:eastAsia="Times New Roman" w:hAnsi="Times New Roman" w:cs="Times New Roman"/>
                 <w:sz w:val="24"/>
                 <w:szCs w:val="24"/>
+                <w:highlight w:val="yellow"/>
               </w:rPr>
               <w:t>Database and backend development</w:t>
             </w:r>
@@ -5104,6 +5121,7 @@
           <w:rFonts w:ascii="Times New Roman" w:eastAsia="Times New Roman" w:hAnsi="Times New Roman" w:cs="Times New Roman"/>
           <w:sz w:val="24"/>
           <w:szCs w:val="24"/>
+          <w:highlight w:val="yellow"/>
         </w:rPr>
       </w:pPr>
     </w:p>
@@ -5155,6 +5173,7 @@
                 <w:rFonts w:ascii="Times New Roman" w:eastAsia="Times New Roman" w:hAnsi="Times New Roman" w:cs="Times New Roman"/>
                 <w:sz w:val="24"/>
                 <w:szCs w:val="24"/>
+                <w:highlight w:val="yellow"/>
               </w:rPr>
             </w:pPr>
             <w:r>
@@ -5162,6 +5181,7 @@
                 <w:rFonts w:ascii="Times New Roman" w:eastAsia="Times New Roman" w:hAnsi="Times New Roman" w:cs="Times New Roman"/>
                 <w:sz w:val="24"/>
                 <w:szCs w:val="24"/>
+                <w:highlight w:val="yellow"/>
               </w:rPr>
               <w:t>M4</w:t>
             </w:r>
@@ -5191,6 +5211,7 @@
                 <w:rFonts w:ascii="Times New Roman" w:eastAsia="Times New Roman" w:hAnsi="Times New Roman" w:cs="Times New Roman"/>
                 <w:sz w:val="24"/>
                 <w:szCs w:val="24"/>
+                <w:highlight w:val="yellow"/>
               </w:rPr>
             </w:pPr>
             <w:r>
@@ -5198,6 +5219,7 @@
                 <w:rFonts w:ascii="Times New Roman" w:eastAsia="Times New Roman" w:hAnsi="Times New Roman" w:cs="Times New Roman"/>
                 <w:sz w:val="24"/>
                 <w:szCs w:val="24"/>
+                <w:highlight w:val="yellow"/>
               </w:rPr>
               <w:t>Frontend development and integration</w:t>
             </w:r>
@@ -5213,6 +5235,7 @@
           <w:rFonts w:ascii="Times New Roman" w:eastAsia="Times New Roman" w:hAnsi="Times New Roman" w:cs="Times New Roman"/>
           <w:sz w:val="24"/>
           <w:szCs w:val="24"/>
+          <w:highlight w:val="yellow"/>
         </w:rPr>
       </w:pPr>
     </w:p>
@@ -5264,6 +5287,7 @@
                 <w:rFonts w:ascii="Times New Roman" w:eastAsia="Times New Roman" w:hAnsi="Times New Roman" w:cs="Times New Roman"/>
                 <w:sz w:val="24"/>
                 <w:szCs w:val="24"/>
+                <w:highlight w:val="yellow"/>
               </w:rPr>
             </w:pPr>
             <w:r>
@@ -5271,6 +5295,7 @@
                 <w:rFonts w:ascii="Times New Roman" w:eastAsia="Times New Roman" w:hAnsi="Times New Roman" w:cs="Times New Roman"/>
                 <w:sz w:val="24"/>
                 <w:szCs w:val="24"/>
+                <w:highlight w:val="yellow"/>
               </w:rPr>
               <w:t>M5</w:t>
             </w:r>
@@ -5300,6 +5325,7 @@
                 <w:rFonts w:ascii="Times New Roman" w:eastAsia="Times New Roman" w:hAnsi="Times New Roman" w:cs="Times New Roman"/>
                 <w:sz w:val="24"/>
                 <w:szCs w:val="24"/>
+                <w:highlight w:val="yellow"/>
               </w:rPr>
             </w:pPr>
             <w:r>
@@ -5307,6 +5333,7 @@
                 <w:rFonts w:ascii="Times New Roman" w:eastAsia="Times New Roman" w:hAnsi="Times New Roman" w:cs="Times New Roman"/>
                 <w:sz w:val="24"/>
                 <w:szCs w:val="24"/>
+                <w:highlight w:val="yellow"/>
               </w:rPr>
               <w:t>Testing and correction</w:t>
             </w:r>
@@ -5322,13 +5349,15 @@
           <w:rFonts w:ascii="Times New Roman" w:eastAsia="Times New Roman" w:hAnsi="Times New Roman" w:cs="Times New Roman"/>
           <w:sz w:val="24"/>
           <w:szCs w:val="24"/>
-        </w:rPr>
-      </w:pPr>
-      <w:r>
-        <w:rPr>
-          <w:rFonts w:ascii="Times New Roman" w:eastAsia="Times New Roman" w:hAnsi="Times New Roman" w:cs="Times New Roman"/>
-          <w:sz w:val="24"/>
-          <w:szCs w:val="24"/>
+          <w:highlight w:val="yellow"/>
+        </w:rPr>
+      </w:pPr>
+      <w:r>
+        <w:rPr>
+          <w:rFonts w:ascii="Times New Roman" w:eastAsia="Times New Roman" w:hAnsi="Times New Roman" w:cs="Times New Roman"/>
+          <w:sz w:val="24"/>
+          <w:szCs w:val="24"/>
+          <w:highlight w:val="yellow"/>
         </w:rPr>
         <w:t xml:space="preserve">Well the dates and task distribution should be inserted from the approved Gantt chart. </w:t>
       </w:r>
@@ -5341,28 +5370,31 @@
           <w:rFonts w:ascii="Times New Roman" w:eastAsia="Times New Roman" w:hAnsi="Times New Roman" w:cs="Times New Roman"/>
           <w:sz w:val="24"/>
           <w:szCs w:val="24"/>
-        </w:rPr>
-      </w:pPr>
-    </w:p>
-    <w:p>
-      <w:pPr>
-        <w:spacing w:line="480" w:lineRule="auto"/>
-        <w:jc w:val="both"/>
-        <w:rPr>
-          <w:rFonts w:ascii="Times New Roman" w:eastAsia="Times New Roman" w:hAnsi="Times New Roman" w:cs="Times New Roman"/>
-          <w:sz w:val="24"/>
-          <w:szCs w:val="24"/>
-        </w:rPr>
-      </w:pPr>
-    </w:p>
-    <w:p>
-      <w:pPr>
-        <w:spacing w:line="480" w:lineRule="auto"/>
-        <w:jc w:val="both"/>
-        <w:rPr>
-          <w:rFonts w:ascii="Times New Roman" w:eastAsia="Times New Roman" w:hAnsi="Times New Roman" w:cs="Times New Roman"/>
-          <w:sz w:val="24"/>
-          <w:szCs w:val="24"/>
+          <w:highlight w:val="yellow"/>
+        </w:rPr>
+      </w:pPr>
+    </w:p>
+    <w:p>
+      <w:pPr>
+        <w:spacing w:line="480" w:lineRule="auto"/>
+        <w:jc w:val="both"/>
+        <w:rPr>
+          <w:rFonts w:ascii="Times New Roman" w:eastAsia="Times New Roman" w:hAnsi="Times New Roman" w:cs="Times New Roman"/>
+          <w:sz w:val="24"/>
+          <w:szCs w:val="24"/>
+          <w:highlight w:val="yellow"/>
+        </w:rPr>
+      </w:pPr>
+    </w:p>
+    <w:p>
+      <w:pPr>
+        <w:spacing w:line="480" w:lineRule="auto"/>
+        <w:jc w:val="both"/>
+        <w:rPr>
+          <w:rFonts w:ascii="Times New Roman" w:eastAsia="Times New Roman" w:hAnsi="Times New Roman" w:cs="Times New Roman"/>
+          <w:sz w:val="24"/>
+          <w:szCs w:val="24"/>
+          <w:highlight w:val="yellow"/>
         </w:rPr>
       </w:pPr>
     </w:p>
@@ -5403,6 +5435,7 @@
                 <w:rFonts w:ascii="Times New Roman" w:eastAsia="Times New Roman" w:hAnsi="Times New Roman" w:cs="Times New Roman"/>
                 <w:sz w:val="24"/>
                 <w:szCs w:val="24"/>
+                <w:highlight w:val="yellow"/>
               </w:rPr>
             </w:pPr>
             <w:r>
@@ -5410,6 +5443,7 @@
                 <w:rFonts w:ascii="Times New Roman" w:eastAsia="Times New Roman" w:hAnsi="Times New Roman" w:cs="Times New Roman"/>
                 <w:sz w:val="24"/>
                 <w:szCs w:val="24"/>
+                <w:highlight w:val="yellow"/>
               </w:rPr>
               <w:t>M6</w:t>
             </w:r>
@@ -5434,6 +5468,7 @@
                 <w:rFonts w:ascii="Times New Roman" w:eastAsia="Times New Roman" w:hAnsi="Times New Roman" w:cs="Times New Roman"/>
                 <w:sz w:val="24"/>
                 <w:szCs w:val="24"/>
+                <w:highlight w:val="yellow"/>
               </w:rPr>
               <w:t>Documentation, demonstration, and final submission</w:t>
             </w:r>
@@ -5481,8 +5516,8 @@
         <w:keepLines w:val="0"/>
         <w:spacing w:before="360" w:after="80"/>
       </w:pPr>
-      <w:bookmarkStart w:id="22" w:name="_dmx0g2yelsq" w:colFirst="0" w:colLast="0"/>
-      <w:bookmarkEnd w:id="22"/>
+      <w:bookmarkStart w:id="21" w:name="_dmx0g2yelsq" w:colFirst="0" w:colLast="0"/>
+      <w:bookmarkEnd w:id="21"/>
       <w:r>
         <w:rPr>
           <w:b/>
@@ -5618,6 +5653,8 @@
           <w:szCs w:val="24"/>
         </w:rPr>
       </w:pPr>
+      <w:bookmarkStart w:id="22" w:name="_GoBack"/>
+      <w:bookmarkEnd w:id="22"/>
     </w:p>
     <w:p>
       <w:pPr>

</xml_diff>